<commit_message>
Populate table of contents in white paper DOCX and PDF
Generate TOC entries directly in the document XML with proper
heading hierarchy (H1 bold, H2 indented), since LibreOffice
headless does not update TOC fields during PDF conversion.

Made-with: Cursor
</commit_message>
<xml_diff>
--- a/docs/Metering-and-Cost-Management-for-Sovereign-Clouds.docx
+++ b/docs/Metering-and-Cost-Management-for-Sovereign-Clouds.docx
@@ -52,11 +52,473 @@
       </w:r>
     </w:p>
     <w:p>
-      <w:r>
-        <w:fldChar w:fldCharType="begin"/>
-        <w:instrText xml:space="preserve"> TOC \o "1-3" \h \z \u </w:instrText>
-        <w:fldChar w:fldCharType="separate"/>
-        <w:fldChar w:fldCharType="end"/>
+      <w:pPr>
+        <w:spacing w:after="60" w:line="276" w:lineRule="auto"/>
+        <w:rPr>
+          <w:sz w:val="22"/>
+          <w:szCs w:val="22"/>
+        </w:rPr>
+      </w:pPr>
+      <w:r>
+        <w:rPr>
+          <w:b w:val="1"/>
+          <w:bCs w:val="1"/>
+          <w:sz w:val="22"/>
+          <w:szCs w:val="22"/>
+        </w:rPr>
+        <w:t>Executive Summary</w:t>
+      </w:r>
+    </w:p>
+    <w:p>
+      <w:pPr>
+        <w:spacing w:after="60" w:line="276" w:lineRule="auto"/>
+        <w:rPr>
+          <w:sz w:val="22"/>
+          <w:szCs w:val="22"/>
+        </w:rPr>
+      </w:pPr>
+      <w:r>
+        <w:rPr>
+          <w:b w:val="1"/>
+          <w:bCs w:val="1"/>
+          <w:sz w:val="22"/>
+          <w:szCs w:val="22"/>
+        </w:rPr>
+        <w:t>1. The Sovereignty Imperative — and Its Blind Spot</w:t>
+      </w:r>
+    </w:p>
+    <w:p>
+      <w:pPr>
+        <w:spacing w:after="60" w:line="276" w:lineRule="auto"/>
+        <w:rPr>
+          <w:sz w:val="22"/>
+          <w:szCs w:val="22"/>
+        </w:rPr>
+      </w:pPr>
+      <w:r>
+        <w:rPr>
+          <w:b w:val="1"/>
+          <w:bCs w:val="1"/>
+          <w:sz w:val="22"/>
+          <w:szCs w:val="22"/>
+        </w:rPr>
+        <w:t>2. Why Existing FinOps Tools Fail in Sovereign Environments</w:t>
+      </w:r>
+    </w:p>
+    <w:p>
+      <w:pPr>
+        <w:spacing w:after="60" w:line="276" w:lineRule="auto"/>
+        <w:ind w:left="360"/>
+        <w:rPr>
+          <w:sz w:val="20"/>
+          <w:szCs w:val="20"/>
+        </w:rPr>
+      </w:pPr>
+      <w:r>
+        <w:rPr>
+          <w:sz w:val="20"/>
+          <w:szCs w:val="20"/>
+        </w:rPr>
+        <w:t>2.1 Data Exfiltration by Design</w:t>
+      </w:r>
+    </w:p>
+    <w:p>
+      <w:pPr>
+        <w:spacing w:after="60" w:line="276" w:lineRule="auto"/>
+        <w:ind w:left="360"/>
+        <w:rPr>
+          <w:sz w:val="20"/>
+          <w:szCs w:val="20"/>
+        </w:rPr>
+      </w:pPr>
+      <w:r>
+        <w:rPr>
+          <w:sz w:val="20"/>
+          <w:szCs w:val="20"/>
+        </w:rPr>
+        <w:t>2.2 Insufficient Depth for Commercial Operations</w:t>
+      </w:r>
+    </w:p>
+    <w:p>
+      <w:pPr>
+        <w:spacing w:after="60" w:line="276" w:lineRule="auto"/>
+        <w:ind w:left="360"/>
+        <w:rPr>
+          <w:sz w:val="20"/>
+          <w:szCs w:val="20"/>
+        </w:rPr>
+      </w:pPr>
+      <w:r>
+        <w:rPr>
+          <w:sz w:val="20"/>
+          <w:szCs w:val="20"/>
+        </w:rPr>
+        <w:t>2.3 No Path from Metering to Billing</w:t>
+      </w:r>
+    </w:p>
+    <w:p>
+      <w:pPr>
+        <w:spacing w:after="60" w:line="276" w:lineRule="auto"/>
+        <w:rPr>
+          <w:sz w:val="22"/>
+          <w:szCs w:val="22"/>
+        </w:rPr>
+      </w:pPr>
+      <w:r>
+        <w:rPr>
+          <w:b w:val="1"/>
+          <w:bCs w:val="1"/>
+          <w:sz w:val="22"/>
+          <w:szCs w:val="22"/>
+        </w:rPr>
+        <w:t>3. The Business Case: Why a CIO Should Care</w:t>
+      </w:r>
+    </w:p>
+    <w:p>
+      <w:pPr>
+        <w:spacing w:after="60" w:line="276" w:lineRule="auto"/>
+        <w:ind w:left="360"/>
+        <w:rPr>
+          <w:sz w:val="20"/>
+          <w:szCs w:val="20"/>
+        </w:rPr>
+      </w:pPr>
+      <w:r>
+        <w:rPr>
+          <w:sz w:val="20"/>
+          <w:szCs w:val="20"/>
+        </w:rPr>
+        <w:t>3.1 Revenue Enablement</w:t>
+      </w:r>
+    </w:p>
+    <w:p>
+      <w:pPr>
+        <w:spacing w:after="60" w:line="276" w:lineRule="auto"/>
+        <w:ind w:left="360"/>
+        <w:rPr>
+          <w:sz w:val="20"/>
+          <w:szCs w:val="20"/>
+        </w:rPr>
+      </w:pPr>
+      <w:r>
+        <w:rPr>
+          <w:sz w:val="20"/>
+          <w:szCs w:val="20"/>
+        </w:rPr>
+        <w:t>3.2 Operational Visibility</w:t>
+      </w:r>
+    </w:p>
+    <w:p>
+      <w:pPr>
+        <w:spacing w:after="60" w:line="276" w:lineRule="auto"/>
+        <w:ind w:left="360"/>
+        <w:rPr>
+          <w:sz w:val="20"/>
+          <w:szCs w:val="20"/>
+        </w:rPr>
+      </w:pPr>
+      <w:r>
+        <w:rPr>
+          <w:sz w:val="20"/>
+          <w:szCs w:val="20"/>
+        </w:rPr>
+        <w:t>3.3 Compliance and Auditability</w:t>
+      </w:r>
+    </w:p>
+    <w:p>
+      <w:pPr>
+        <w:spacing w:after="60" w:line="276" w:lineRule="auto"/>
+        <w:ind w:left="360"/>
+        <w:rPr>
+          <w:sz w:val="20"/>
+          <w:szCs w:val="20"/>
+        </w:rPr>
+      </w:pPr>
+      <w:r>
+        <w:rPr>
+          <w:sz w:val="20"/>
+          <w:szCs w:val="20"/>
+        </w:rPr>
+        <w:t>3.4 Competitive Differentiation</w:t>
+      </w:r>
+    </w:p>
+    <w:p>
+      <w:pPr>
+        <w:spacing w:after="60" w:line="276" w:lineRule="auto"/>
+        <w:rPr>
+          <w:sz w:val="22"/>
+          <w:szCs w:val="22"/>
+        </w:rPr>
+      </w:pPr>
+      <w:r>
+        <w:rPr>
+          <w:b w:val="1"/>
+          <w:bCs w:val="1"/>
+          <w:sz w:val="22"/>
+          <w:szCs w:val="22"/>
+        </w:rPr>
+        <w:t>4. The On-Premise Advantage: Keeping Financial Data Sovereign</w:t>
+      </w:r>
+    </w:p>
+    <w:p>
+      <w:pPr>
+        <w:spacing w:after="60" w:line="276" w:lineRule="auto"/>
+        <w:ind w:left="360"/>
+        <w:rPr>
+          <w:sz w:val="20"/>
+          <w:szCs w:val="20"/>
+        </w:rPr>
+      </w:pPr>
+      <w:r>
+        <w:rPr>
+          <w:sz w:val="20"/>
+          <w:szCs w:val="20"/>
+        </w:rPr>
+        <w:t>What It Measures</w:t>
+      </w:r>
+    </w:p>
+    <w:p>
+      <w:pPr>
+        <w:spacing w:after="60" w:line="276" w:lineRule="auto"/>
+        <w:ind w:left="360"/>
+        <w:rPr>
+          <w:sz w:val="20"/>
+          <w:szCs w:val="20"/>
+        </w:rPr>
+      </w:pPr>
+      <w:r>
+        <w:rPr>
+          <w:sz w:val="20"/>
+          <w:szCs w:val="20"/>
+        </w:rPr>
+        <w:t>Why It Leads the Market for On-Premise OpenShift</w:t>
+      </w:r>
+    </w:p>
+    <w:p>
+      <w:pPr>
+        <w:spacing w:after="60" w:line="276" w:lineRule="auto"/>
+        <w:rPr>
+          <w:sz w:val="22"/>
+          <w:szCs w:val="22"/>
+        </w:rPr>
+      </w:pPr>
+      <w:r>
+        <w:rPr>
+          <w:b w:val="1"/>
+          <w:bCs w:val="1"/>
+          <w:sz w:val="22"/>
+          <w:szCs w:val="22"/>
+        </w:rPr>
+        <w:t>5. From Metering to Monetization: The DCM Approach</w:t>
+      </w:r>
+    </w:p>
+    <w:p>
+      <w:pPr>
+        <w:spacing w:after="60" w:line="276" w:lineRule="auto"/>
+        <w:ind w:left="360"/>
+        <w:rPr>
+          <w:sz w:val="20"/>
+          <w:szCs w:val="20"/>
+        </w:rPr>
+      </w:pPr>
+      <w:r>
+        <w:rPr>
+          <w:sz w:val="20"/>
+          <w:szCs w:val="20"/>
+        </w:rPr>
+        <w:t>5.1 What Is DCM?</w:t>
+      </w:r>
+    </w:p>
+    <w:p>
+      <w:pPr>
+        <w:spacing w:after="60" w:line="276" w:lineRule="auto"/>
+        <w:ind w:left="360"/>
+        <w:rPr>
+          <w:sz w:val="20"/>
+          <w:szCs w:val="20"/>
+        </w:rPr>
+      </w:pPr>
+      <w:r>
+        <w:rPr>
+          <w:sz w:val="20"/>
+          <w:szCs w:val="20"/>
+        </w:rPr>
+        <w:t>5.2 Closing the Loop: Cost as a First-Class Service</w:t>
+      </w:r>
+    </w:p>
+    <w:p>
+      <w:pPr>
+        <w:spacing w:after="60" w:line="276" w:lineRule="auto"/>
+        <w:ind w:left="360"/>
+        <w:rPr>
+          <w:sz w:val="20"/>
+          <w:szCs w:val="20"/>
+        </w:rPr>
+      </w:pPr>
+      <w:r>
+        <w:rPr>
+          <w:sz w:val="20"/>
+          <w:szCs w:val="20"/>
+        </w:rPr>
+        <w:t>5.3 Three Operating Models</w:t>
+      </w:r>
+    </w:p>
+    <w:p>
+      <w:pPr>
+        <w:spacing w:after="60" w:line="276" w:lineRule="auto"/>
+        <w:rPr>
+          <w:sz w:val="22"/>
+          <w:szCs w:val="22"/>
+        </w:rPr>
+      </w:pPr>
+      <w:r>
+        <w:rPr>
+          <w:b w:val="1"/>
+          <w:bCs w:val="1"/>
+          <w:sz w:val="22"/>
+          <w:szCs w:val="22"/>
+        </w:rPr>
+        <w:t>6. Real-World Applications</w:t>
+      </w:r>
+    </w:p>
+    <w:p>
+      <w:pPr>
+        <w:spacing w:after="60" w:line="276" w:lineRule="auto"/>
+        <w:ind w:left="360"/>
+        <w:rPr>
+          <w:sz w:val="20"/>
+          <w:szCs w:val="20"/>
+        </w:rPr>
+      </w:pPr>
+      <w:r>
+        <w:rPr>
+          <w:sz w:val="20"/>
+          <w:szCs w:val="20"/>
+        </w:rPr>
+        <w:t>Sovereign Cloud Providers</w:t>
+      </w:r>
+    </w:p>
+    <w:p>
+      <w:pPr>
+        <w:spacing w:after="60" w:line="276" w:lineRule="auto"/>
+        <w:ind w:left="360"/>
+        <w:rPr>
+          <w:sz w:val="20"/>
+          <w:szCs w:val="20"/>
+        </w:rPr>
+      </w:pPr>
+      <w:r>
+        <w:rPr>
+          <w:sz w:val="20"/>
+          <w:szCs w:val="20"/>
+        </w:rPr>
+        <w:t>Regulated Financial Services</w:t>
+      </w:r>
+    </w:p>
+    <w:p>
+      <w:pPr>
+        <w:spacing w:after="60" w:line="276" w:lineRule="auto"/>
+        <w:ind w:left="360"/>
+        <w:rPr>
+          <w:sz w:val="20"/>
+          <w:szCs w:val="20"/>
+        </w:rPr>
+      </w:pPr>
+      <w:r>
+        <w:rPr>
+          <w:sz w:val="20"/>
+          <w:szCs w:val="20"/>
+        </w:rPr>
+        <w:t>Defense and Government</w:t>
+      </w:r>
+    </w:p>
+    <w:p>
+      <w:pPr>
+        <w:spacing w:after="60" w:line="276" w:lineRule="auto"/>
+        <w:ind w:left="360"/>
+        <w:rPr>
+          <w:sz w:val="20"/>
+          <w:szCs w:val="20"/>
+        </w:rPr>
+      </w:pPr>
+      <w:r>
+        <w:rPr>
+          <w:sz w:val="20"/>
+          <w:szCs w:val="20"/>
+        </w:rPr>
+        <w:t>Internal IT-as-a-Service</w:t>
+      </w:r>
+    </w:p>
+    <w:p>
+      <w:pPr>
+        <w:spacing w:after="60" w:line="276" w:lineRule="auto"/>
+        <w:rPr>
+          <w:sz w:val="22"/>
+          <w:szCs w:val="22"/>
+        </w:rPr>
+      </w:pPr>
+      <w:r>
+        <w:rPr>
+          <w:b w:val="1"/>
+          <w:bCs w:val="1"/>
+          <w:sz w:val="22"/>
+          <w:szCs w:val="22"/>
+        </w:rPr>
+        <w:t>7. Architecture at a Glance</w:t>
+      </w:r>
+    </w:p>
+    <w:p>
+      <w:pPr>
+        <w:spacing w:after="60" w:line="276" w:lineRule="auto"/>
+        <w:rPr>
+          <w:sz w:val="22"/>
+          <w:szCs w:val="22"/>
+        </w:rPr>
+      </w:pPr>
+      <w:r>
+        <w:rPr>
+          <w:b w:val="1"/>
+          <w:bCs w:val="1"/>
+          <w:sz w:val="22"/>
+          <w:szCs w:val="22"/>
+        </w:rPr>
+        <w:t>8. Getting Started</w:t>
+      </w:r>
+    </w:p>
+    <w:p>
+      <w:pPr>
+        <w:spacing w:after="60" w:line="276" w:lineRule="auto"/>
+        <w:rPr>
+          <w:sz w:val="22"/>
+          <w:szCs w:val="22"/>
+        </w:rPr>
+      </w:pPr>
+      <w:r>
+        <w:rPr>
+          <w:b w:val="1"/>
+          <w:bCs w:val="1"/>
+          <w:sz w:val="22"/>
+          <w:szCs w:val="22"/>
+        </w:rPr>
+        <w:t>9. Conclusion</w:t>
+      </w:r>
+    </w:p>
+    <w:p>
+      <w:pPr>
+        <w:spacing w:after="60" w:line="276" w:lineRule="auto"/>
+        <w:rPr>
+          <w:sz w:val="22"/>
+          <w:szCs w:val="22"/>
+        </w:rPr>
+      </w:pPr>
+      <w:r>
+        <w:rPr>
+          <w:b w:val="1"/>
+          <w:bCs w:val="1"/>
+          <w:sz w:val="22"/>
+          <w:szCs w:val="22"/>
+        </w:rPr>
+        <w:t>References</w:t>
       </w:r>
     </w:p>
     <w:p>

</xml_diff>

<commit_message>
Update docs with new Cost Management capabilities and cloud cost support
Add IBM Z/LinuxOne/POWER support, 40+ cost dimensions, GPU/OpenShift AI
metering, REST API data export, and cloud cost management (AWS, Azure,
GCP including ROSA and ARO with automatic subscription cost distribution)
across white paper, integration architecture, and SP design documents.
Regenerate DOCX and PDF.

Made-with: Cursor
</commit_message>
<xml_diff>
--- a/docs/Metering-and-Cost-Management-for-Sovereign-Clouds.docx
+++ b/docs/Metering-and-Cost-Management-for-Sovereign-Clouds.docx
@@ -291,7 +291,7 @@
           <w:sz w:val="20"/>
           <w:szCs w:val="20"/>
         </w:rPr>
-        <w:t>Why It Leads the Market for On-Premise OpenShift</w:t>
+        <w:t>Why It Leads the Market</w:t>
       </w:r>
     </w:p>
     <w:p>
@@ -551,7 +551,7 @@
         <w:t>metering, costing, and chargeback are foundational capabilities</w:t>
       </w:r>
       <w:r>
-        <w:t xml:space="preserve"> for any provider that wants to monetize sovereign infrastructure. It examines why existing FinOps tools fall short in sovereign and on-premise environments, introduces an architecture that keeps all financial and usage data inside the provider’s perimeter, and shows how Red Hat Lightspeed Cost Management and the DCM (Data Center Management) project together close the gap between “we provision infrastructure” and “we get paid for it.”</w:t>
+        <w:t xml:space="preserve"> for any provider that wants to monetize sovereign infrastructure. It examines why existing FinOps tools fall short in sovereign and on-premise environments, introduces an architecture that keeps all financial and usage data inside the provider’s perimeter, and shows how Red Hat Lightspeed Cost Management and the DCM (Data Center Management) project together close the gap between “we provision infrastructure” and “we get paid for it.” Red Hat Lightspeed Cost Management offers more than 40 cost dimensions, is the only tool that supports metering and costing of OpenShift on IBM Z, LinuxOne, and POWER, and makes all metering and cost data available via REST API for integration with any billing, ERP, or business intelligence system.</w:t>
       </w:r>
     </w:p>
     <w:p>
@@ -788,6 +788,24 @@
     </w:p>
     <w:p>
       <w:pPr>
+        <w:numPr>
+          <w:ilvl w:val="0"/>
+          <w:numId w:val="1"/>
+        </w:numPr>
+      </w:pPr>
+      <w:r>
+        <w:rPr>
+          <w:b w:val="1"/>
+          <w:bCs w:val="1"/>
+        </w:rPr>
+        <w:t xml:space="preserve">No support for non-x86 architectures. </w:t>
+      </w:r>
+      <w:r>
+        <w:t>These tools do not support OpenShift on IBM Z, LinuxOne, or POWER — platforms that are foundational in regulated banking, government, and mainframe-centric sovereign environments. Providers whose customers run workloads on these architectures have no open source FinOps option other than Red Hat Lightspeed Cost Management.</w:t>
+      </w:r>
+    </w:p>
+    <w:p>
+      <w:pPr>
         <w:pStyle w:val="Heading2"/>
       </w:pPr>
       <w:r>
@@ -877,6 +895,11 @@
       </w:r>
     </w:p>
     <w:p>
+      <w:r>
+        <w:t>Critically, all metering and cost data is available via a comprehensive REST API, enabling direct integration with any billing platform, ERP system, or business intelligence tool — Excel, Power BI, Tableau, Grafana, and others — so the financial data stays sovereign while still powering the provider’s entire commercial stack.</w:t>
+      </w:r>
+    </w:p>
+    <w:p>
       <w:pPr>
         <w:pStyle w:val="Heading2"/>
       </w:pPr>
@@ -933,6 +956,11 @@
       </w:r>
     </w:p>
     <w:p>
+      <w:r>
+        <w:t>The differentiation extends to technology coverage. Red Hat Lightspeed Cost Management is the only metering and cost management tool — open source or commercial — that supports OpenShift on IBM Z, LinuxOne, and POWER. These platforms remain essential in sovereign banking, government, and mainframe-centric environments. No competing FinOps tool offers this coverage, making it a decisive factor for providers whose customers run workloads on these architectures.</w:t>
+      </w:r>
+    </w:p>
+    <w:p>
       <w:pPr>
         <w:pStyle w:val="Heading1"/>
       </w:pPr>
@@ -986,7 +1014,7 @@
         <w:t xml:space="preserve">Tier 1 — Basic Metering. </w:t>
       </w:r>
       <w:r>
-        <w:t>Without any configuration beyond deploying the metrics operator on each OpenShift cluster, the system collects and reports raw utilization and capacity data: CPU, memory, and storage.</w:t>
+        <w:t>Without any configuration beyond deploying the metrics operator on each OpenShift cluster, the system collects and reports raw utilization and capacity data: CPU, memory, and storage. The metrics operator runs on all supported architectures — x86-64, ARM, IBM Z, LinuxOne, and POWER — making Red Hat Lightspeed Cost Management the only tool that can meter OpenShift across the full range of platforms found in sovereign environments.</w:t>
       </w:r>
     </w:p>
     <w:p>
@@ -1010,7 +1038,7 @@
         <w:t xml:space="preserve">Tier 3 — Full Cost Management. </w:t>
       </w:r>
       <w:r>
-        <w:t>By adding a price list to the cost model, the system applies rates to every measurable dimension: CPU core-hours, memory GB-hours, persistent volume claims, node utilization, VM hours, and more.</w:t>
+        <w:t>By adding a price list to the cost model, the system applies rates across more than 40 cost dimensions: CPU core-hours (usage, request, and effective), memory GB-hours, storage GB-months, node cost per core-hour or per month, cluster cost per month, OpenShift Virtualization VM hours and VM core-hours, PVC months, project months, and GPU (physical devices and NVIDIA MIG slices) — with every metric parameterizable by tag for fine-grained allocation. All metering and cost data is available via a comprehensive REST API, enabling integration with any billing, ERP, or BI system.</w:t>
       </w:r>
     </w:p>
     <w:p>
@@ -1022,7 +1050,7 @@
           <w:b w:val="1"/>
           <w:bCs w:val="1"/>
         </w:rPr>
-        <w:t>Why It Leads the Market for On-Premise OpenShift</w:t>
+        <w:t>Why It Leads the Market</w:t>
       </w:r>
     </w:p>
     <w:p>
@@ -1132,6 +1160,78 @@
           <w:b w:val="1"/>
           <w:bCs w:val="1"/>
         </w:rPr>
+        <w:t xml:space="preserve">Multi-architecture. </w:t>
+      </w:r>
+      <w:r>
+        <w:t>The only FinOps tool — open source or commercial — that supports OpenShift on IBM Z, LinuxOne, and POWER, alongside x86-64 and ARM.</w:t>
+      </w:r>
+    </w:p>
+    <w:p>
+      <w:pPr>
+        <w:numPr>
+          <w:ilvl w:val="0"/>
+          <w:numId w:val="1"/>
+        </w:numPr>
+      </w:pPr>
+      <w:r>
+        <w:rPr>
+          <w:b w:val="1"/>
+          <w:bCs w:val="1"/>
+        </w:rPr>
+        <w:t xml:space="preserve">GPU and AI workload metering. </w:t>
+      </w:r>
+      <w:r>
+        <w:t>Native support for GPU cost tracking (physical devices and NVIDIA MIG slices) and OpenShift AI subscription metering. Support for Model-as-a-Service inference costing and agentic AI workload attribution is in active development.</w:t>
+      </w:r>
+    </w:p>
+    <w:p>
+      <w:pPr>
+        <w:numPr>
+          <w:ilvl w:val="0"/>
+          <w:numId w:val="1"/>
+        </w:numPr>
+      </w:pPr>
+      <w:r>
+        <w:rPr>
+          <w:b w:val="1"/>
+          <w:bCs w:val="1"/>
+        </w:rPr>
+        <w:t xml:space="preserve">Full API data export. </w:t>
+      </w:r>
+      <w:r>
+        <w:t>All metering and cost data is available via REST API, enabling integration with billing platforms, ERP systems, and BI tools without data leaving the sovereign perimeter.</w:t>
+      </w:r>
+    </w:p>
+    <w:p>
+      <w:pPr>
+        <w:numPr>
+          <w:ilvl w:val="0"/>
+          <w:numId w:val="1"/>
+        </w:numPr>
+      </w:pPr>
+      <w:r>
+        <w:rPr>
+          <w:b w:val="1"/>
+          <w:bCs w:val="1"/>
+        </w:rPr>
+        <w:t xml:space="preserve">Cloud cost management. </w:t>
+      </w:r>
+      <w:r>
+        <w:t>Beyond on-premise OpenShift, it also supports cloud costs on Amazon Web Services, Microsoft Azure, and Google Cloud — any cloud service, including private offers and managed OpenShift (ROSA and ARO). For ROSA and ARO, the cost of OpenShift subscriptions is automatically factored in and distributed to workloads, giving hybrid sovereign environments a single pane of glass.</w:t>
+      </w:r>
+    </w:p>
+    <w:p>
+      <w:pPr>
+        <w:numPr>
+          <w:ilvl w:val="0"/>
+          <w:numId w:val="1"/>
+        </w:numPr>
+      </w:pPr>
+      <w:r>
+        <w:rPr>
+          <w:b w:val="1"/>
+          <w:bCs w:val="1"/>
+        </w:rPr>
         <w:t xml:space="preserve">100% open source. </w:t>
       </w:r>
       <w:r>
@@ -1317,6 +1417,11 @@
       </w:r>
     </w:p>
     <w:p>
+      <w:r>
+        <w:t>This applies uniformly across all supported architectures — x86-64, ARM, IBM Z, LinuxOne, and POWER — and includes GPU overhead distribution for clusters equipped with GPUs. All cost data is accessible via the REST API, enabling DCM or downstream billing systems to query costs programmatically.</w:t>
+      </w:r>
+    </w:p>
+    <w:p>
       <w:pPr>
         <w:pStyle w:val="Heading2"/>
       </w:pPr>
@@ -1391,12 +1496,12 @@
     </w:p>
     <w:p>
       <w:r>
-        <w:t>A leading Swiss sovereign cloud provider built its platform on Red Hat OpenShift, offering public and private cloud options to customers in regulated sectors including finance, healthcare, and government. By integrating cost transparency directly into its self-service portal, the provider reduced customer onboarding time and enabled tenants to monitor their own consumption in real time.</w:t>
-      </w:r>
-    </w:p>
-    <w:p>
-      <w:r>
-        <w:t>An Indian sovereign AI infrastructure provider built a sovereign AI factory on Red Hat technologies, serving government entities and businesses that require localized, high-performance AI infrastructure with data that remains within the country’s borders.</w:t>
+        <w:t>A leading Swiss sovereign cloud provider built its platform on Red Hat OpenShift, offering public and private cloud options to customers in regulated sectors including finance, healthcare, and government. By integrating cost transparency directly into its self-service portal, the provider reduced customer onboarding time and enabled tenants to monitor their own consumption in real time. The provider uses the REST API to export cost data into its existing billing platform, enabling automated invoice generation without any data leaving its sovereign perimeter.</w:t>
+      </w:r>
+    </w:p>
+    <w:p>
+      <w:r>
+        <w:t>An Indian sovereign AI infrastructure provider built a sovereign AI factory on Red Hat technologies, serving government entities and businesses that require localized, high-performance AI infrastructure with data that remains within the country’s borders. GPU metering enables the provider to bill customers per GPU-hour and per NVIDIA MIG slice, a granularity that no other on-premise FinOps tool provides.</w:t>
       </w:r>
     </w:p>
     <w:p>
@@ -1413,7 +1518,7 @@
     </w:p>
     <w:p>
       <w:r>
-        <w:t>A leading European bank is running a sovereign AI factory platform built on Red Hat OpenShift AI, delivering GPU-as-a-Service and LLM-as-a-Service across the group. To sustain the investment and allocate costs fairly across business units, the bank requires granular metering of GPU hours, model inference requests, and storage consumption — all retained within its own infrastructure.</w:t>
+        <w:t>A leading European bank is running a sovereign AI factory platform built on Red Hat OpenShift AI, delivering GPU-as-a-Service and LLM-as-a-Service across the group. To sustain the investment and allocate costs fairly across business units, the bank requires granular metering of GPU hours, model inference requests, and storage consumption — all retained within its own infrastructure. The bank’s core systems run on IBM Z; Red Hat Lightspeed Cost Management is the only tool that can meter OpenShift workloads on Z and the GPU clusters in a unified view, with all cost data exported via the API to the bank’s internal ERP system.</w:t>
       </w:r>
     </w:p>
     <w:p>
@@ -1435,7 +1540,7 @@
     </w:p>
     <w:p>
       <w:r>
-        <w:t>Government agencies across Europe are building sovereign cloud infrastructure aligned with national strategies: France’s SecNumCloud, Germany’s BSI C5, Italy’s Polo Strategico Nazionale, Spain’s National Cloud Strategy, and Nordic “Plan B” hybrid architectures.</w:t>
+        <w:t>Government agencies across Europe are building sovereign cloud infrastructure aligned with national strategies: France’s SecNumCloud, Germany’s BSI C5, Italy’s Polo Strategico Nazionale, Spain’s National Cloud Strategy, and Nordic “Plan B” hybrid architectures. Many of these environments include IBM Z or POWER systems for legacy workloads, making cross-architecture metering a key requirement.</w:t>
       </w:r>
     </w:p>
     <w:p>
@@ -1452,7 +1557,7 @@
     </w:p>
     <w:p>
       <w:r>
-        <w:t>The same architecture applies to large enterprises operating an internal shared-services model. Red Hat Lightspeed Cost Management’s overhead distribution capability enables the central IT organization to transparently allocate not just direct workload costs but also the shared platform overhead — proportionally to each business unit based on their actual usage.</w:t>
+        <w:t>The same architecture applies to large enterprises operating an internal shared-services model. Red Hat Lightspeed Cost Management’s overhead distribution capability enables the central IT organization to transparently allocate not just direct workload costs but also the shared platform overhead — proportionally to each business unit based on their actual usage. In organizations that span x86-64, ARM, and IBM Z or POWER infrastructure, the tool provides a unified view of costs across all platforms. The REST API enables automated export of cost reports to the enterprise’s financial systems, eliminating manual reconciliation.</w:t>
       </w:r>
     </w:p>
     <w:p>

</xml_diff>

<commit_message>
Add fine-grained RBAC and resource optimization capabilities to docs
Document Koku's RBAC (multi-tenant cost visibility isolation) and resource
optimization (rightsizing recommendations) across white paper, integration
architecture, SP design, and README. RBAC is highly relevant for sovereign
cloud providers giving tenants self-service cost access. Regenerate DOCX/PDF.

Made-with: Cursor
</commit_message>
<xml_diff>
--- a/docs/Metering-and-Cost-Management-for-Sovereign-Clouds.docx
+++ b/docs/Metering-and-Cost-Management-for-Sovereign-Clouds.docx
@@ -1142,6 +1142,24 @@
           <w:b w:val="1"/>
           <w:bCs w:val="1"/>
         </w:rPr>
+        <w:t xml:space="preserve">Fine-grained RBAC. </w:t>
+      </w:r>
+      <w:r>
+        <w:t>The provider aggregates all clusters, VMs, namespaces, and projects in a single instance, then uses role-based access control to restrict what each user — or each sovereign cloud tenant — can see and do. A tenant given read access sees only their own namespaces and costs, never another tenant’s data.</w:t>
+      </w:r>
+    </w:p>
+    <w:p>
+      <w:pPr>
+        <w:numPr>
+          <w:ilvl w:val="0"/>
+          <w:numId w:val="1"/>
+        </w:numPr>
+      </w:pPr>
+      <w:r>
+        <w:rPr>
+          <w:b w:val="1"/>
+          <w:bCs w:val="1"/>
+        </w:rPr>
         <w:t xml:space="preserve">Complete data residency. </w:t>
       </w:r>
       <w:r>
@@ -1232,6 +1250,24 @@
           <w:b w:val="1"/>
           <w:bCs w:val="1"/>
         </w:rPr>
+        <w:t xml:space="preserve">Resource optimization. </w:t>
+      </w:r>
+      <w:r>
+        <w:t>Beyond cost tracking, the platform includes a resource optimization feature that provides rightsizing recommendations for containers, deployments, and jobs — offering both cost-optimized and performance-optimized options.</w:t>
+      </w:r>
+    </w:p>
+    <w:p>
+      <w:pPr>
+        <w:numPr>
+          <w:ilvl w:val="0"/>
+          <w:numId w:val="1"/>
+        </w:numPr>
+      </w:pPr>
+      <w:r>
+        <w:rPr>
+          <w:b w:val="1"/>
+          <w:bCs w:val="1"/>
+        </w:rPr>
         <w:t xml:space="preserve">100% open source. </w:t>
       </w:r>
       <w:r>
@@ -1466,7 +1502,7 @@
         <w:t xml:space="preserve">Tenant Self-Service. </w:t>
       </w:r>
       <w:r>
-        <w:t>Tenants can view their own metering and cost data through read-only dashboards, understanding their consumption without needing access to the underlying cost management system.</w:t>
+        <w:t>Tenants can view their own metering and cost data through read-only dashboards, understanding their consumption without needing access to the underlying cost management system. Fine-grained RBAC ensures each tenant sees only their own namespaces, clusters, and costs — never another tenant’s data — preserving multi-tenant isolation.</w:t>
       </w:r>
     </w:p>
     <w:p>
@@ -1496,7 +1532,7 @@
     </w:p>
     <w:p>
       <w:r>
-        <w:t>A leading Swiss sovereign cloud provider built its platform on Red Hat OpenShift, offering public and private cloud options to customers in regulated sectors including finance, healthcare, and government. By integrating cost transparency directly into its self-service portal, the provider reduced customer onboarding time and enabled tenants to monitor their own consumption in real time. The provider uses the REST API to export cost data into its existing billing platform, enabling automated invoice generation without any data leaving its sovereign perimeter.</w:t>
+        <w:t>A leading Swiss sovereign cloud provider built its platform on Red Hat OpenShift, offering public and private cloud options to customers in regulated sectors including finance, healthcare, and government. By integrating cost transparency directly into its self-service portal, the provider reduced customer onboarding time and enabled tenants to monitor their own consumption in real time. Fine-grained RBAC ensures each tenant sees only their own namespaces and costs, preserving multi-tenant isolation. The provider uses the REST API to export cost data into its existing billing platform, enabling automated invoice generation without any data leaving its sovereign perimeter.</w:t>
       </w:r>
     </w:p>
     <w:p>
@@ -1557,7 +1593,7 @@
     </w:p>
     <w:p>
       <w:r>
-        <w:t>The same architecture applies to large enterprises operating an internal shared-services model. Red Hat Lightspeed Cost Management’s overhead distribution capability enables the central IT organization to transparently allocate not just direct workload costs but also the shared platform overhead — proportionally to each business unit based on their actual usage. In organizations that span x86-64, ARM, and IBM Z or POWER infrastructure, the tool provides a unified view of costs across all platforms. The REST API enables automated export of cost reports to the enterprise’s financial systems, eliminating manual reconciliation.</w:t>
+        <w:t>The same architecture applies to large enterprises operating an internal shared-services model. Red Hat Lightspeed Cost Management’s overhead distribution capability enables the central IT organization to transparently allocate not just direct workload costs but also the shared platform overhead — proportionally to each business unit based on their actual usage. Fine-grained RBAC enables each business unit to view its own cost data directly — without seeing other divisions’ consumption — making self-service chargeback practical even across organizational boundaries. In organizations that span x86-64, ARM, and IBM Z or POWER infrastructure, the tool provides a unified view of costs across all platforms. The REST API enables automated export of cost reports to the enterprise’s financial systems, eliminating manual reconciliation.</w:t>
       </w:r>
     </w:p>
     <w:p>

</xml_diff>

<commit_message>
Reduce architecture diagram to 85% width so caption stays on same page
Made-with: Cursor
</commit_message>
<xml_diff>
--- a/docs/Metering-and-Cost-Management-for-Sovereign-Clouds.docx
+++ b/docs/Metering-and-Cost-Management-for-Sovereign-Clouds.docx
@@ -1616,7 +1616,7 @@
       <w:r>
         <w:drawing>
           <wp:inline distT="0" distB="0" distL="0" distR="0">
-            <wp:extent cx="5943600" cy="7837660"/>
+            <wp:extent cx="5052060" cy="6662011"/>
             <wp:docPr id="100" name="arch-diagram"/>
             <a:graphic>
               <a:graphicData uri="http://schemas.openxmlformats.org/drawingml/2006/picture">
@@ -1634,7 +1634,7 @@
                   <pic:spPr>
                     <a:xfrm>
                       <a:off x="0" y="0"/>
-                      <a:ext cx="5943600" cy="7837660"/>
+                      <a:ext cx="5052060" cy="6662011"/>
                     </a:xfrm>
                     <a:prstGeom prst="rect"/>
                   </pic:spPr>

</xml_diff>

<commit_message>
Adjust architecture diagram to 92% width
Made-with: Cursor
</commit_message>
<xml_diff>
--- a/docs/Metering-and-Cost-Management-for-Sovereign-Clouds.docx
+++ b/docs/Metering-and-Cost-Management-for-Sovereign-Clouds.docx
@@ -1616,7 +1616,7 @@
       <w:r>
         <w:drawing>
           <wp:inline distT="0" distB="0" distL="0" distR="0">
-            <wp:extent cx="5052060" cy="6662011"/>
+            <wp:extent cx="5468112" cy="7210647"/>
             <wp:docPr id="100" name="arch-diagram"/>
             <a:graphic>
               <a:graphicData uri="http://schemas.openxmlformats.org/drawingml/2006/picture">
@@ -1634,7 +1634,7 @@
                   <pic:spPr>
                     <a:xfrm>
                       <a:off x="0" y="0"/>
-                      <a:ext cx="5052060" cy="6662011"/>
+                      <a:ext cx="5468112" cy="7210647"/>
                     </a:xfrm>
                     <a:prstGeom prst="rect"/>
                   </pic:spPr>

</xml_diff>

<commit_message>
Adjust architecture diagram to 96% width
Made-with: Cursor
</commit_message>
<xml_diff>
--- a/docs/Metering-and-Cost-Management-for-Sovereign-Clouds.docx
+++ b/docs/Metering-and-Cost-Management-for-Sovereign-Clouds.docx
@@ -1616,7 +1616,7 @@
       <w:r>
         <w:drawing>
           <wp:inline distT="0" distB="0" distL="0" distR="0">
-            <wp:extent cx="5468112" cy="7210647"/>
+            <wp:extent cx="5705856" cy="7524153"/>
             <wp:docPr id="100" name="arch-diagram"/>
             <a:graphic>
               <a:graphicData uri="http://schemas.openxmlformats.org/drawingml/2006/picture">
@@ -1634,7 +1634,7 @@
                   <pic:spPr>
                     <a:xfrm>
                       <a:off x="0" y="0"/>
-                      <a:ext cx="5468112" cy="7210647"/>
+                      <a:ext cx="5705856" cy="7524153"/>
                     </a:xfrm>
                     <a:prstGeom prst="rect"/>
                   </pic:spPr>

</xml_diff>

<commit_message>
Adjust architecture diagram to 90% width
Made-with: Cursor
</commit_message>
<xml_diff>
--- a/docs/Metering-and-Cost-Management-for-Sovereign-Clouds.docx
+++ b/docs/Metering-and-Cost-Management-for-Sovereign-Clouds.docx
@@ -1616,7 +1616,7 @@
       <w:r>
         <w:drawing>
           <wp:inline distT="0" distB="0" distL="0" distR="0">
-            <wp:extent cx="5705856" cy="7524153"/>
+            <wp:extent cx="5408676" cy="7132270"/>
             <wp:docPr id="100" name="arch-diagram"/>
             <a:graphic>
               <a:graphicData uri="http://schemas.openxmlformats.org/drawingml/2006/picture">
@@ -1634,7 +1634,7 @@
                   <pic:spPr>
                     <a:xfrm>
                       <a:off x="0" y="0"/>
-                      <a:ext cx="5705856" cy="7524153"/>
+                      <a:ext cx="5408676" cy="7132270"/>
                     </a:xfrm>
                     <a:prstGeom prst="rect"/>
                   </pic:spPr>

</xml_diff>

<commit_message>
Add Resources section to white paper with product and project links
Separate from the numbered References (analyst reports), add a Resources
section with links to Red Hat Lightspeed Cost Management product page,
Project Koku, koku-metrics-operator, and DCM Project.

Made-with: Cursor
</commit_message>
<xml_diff>
--- a/docs/Metering-and-Cost-Management-for-Sovereign-Clouds.docx
+++ b/docs/Metering-and-Cost-Management-for-Sovereign-Clouds.docx
@@ -519,6 +519,23 @@
           <w:szCs w:val="22"/>
         </w:rPr>
         <w:t>References</w:t>
+      </w:r>
+    </w:p>
+    <w:p>
+      <w:pPr>
+        <w:spacing w:after="60" w:line="276" w:lineRule="auto"/>
+        <w:ind w:left="360"/>
+        <w:rPr>
+          <w:sz w:val="20"/>
+          <w:szCs w:val="20"/>
+        </w:rPr>
+      </w:pPr>
+      <w:r>
+        <w:rPr>
+          <w:sz w:val="20"/>
+          <w:szCs w:val="20"/>
+        </w:rPr>
+        <w:t>Resources</w:t>
       </w:r>
     </w:p>
     <w:p>
@@ -1915,6 +1932,99 @@
           <w:szCs w:val="18"/>
         </w:rPr>
         <w:t>6. Linux Foundation, The State of Sovereign AI, August 2025.</w:t>
+      </w:r>
+    </w:p>
+    <w:p/>
+    <w:p>
+      <w:pPr>
+        <w:pStyle w:val="Heading2"/>
+      </w:pPr>
+      <w:r>
+        <w:rPr>
+          <w:b w:val="1"/>
+          <w:bCs w:val="1"/>
+        </w:rPr>
+        <w:t>Resources</w:t>
+      </w:r>
+    </w:p>
+    <w:p>
+      <w:r>
+        <w:rPr>
+          <w:b w:val="1"/>
+          <w:bCs w:val="1"/>
+          <w:color w:val="666666"/>
+          <w:sz w:val="18"/>
+          <w:szCs w:val="18"/>
+        </w:rPr>
+        <w:t>Red Hat Lightspeed Cost Management</w:t>
+      </w:r>
+      <w:r>
+        <w:rPr>
+          <w:color w:val="666666"/>
+          <w:sz w:val="18"/>
+          <w:szCs w:val="18"/>
+        </w:rPr>
+        <w:t xml:space="preserve"> — Product page and documentation: https://access.redhat.com/products/cost-management</w:t>
+      </w:r>
+    </w:p>
+    <w:p>
+      <w:r>
+        <w:rPr>
+          <w:b w:val="1"/>
+          <w:bCs w:val="1"/>
+          <w:color w:val="666666"/>
+          <w:sz w:val="18"/>
+          <w:szCs w:val="18"/>
+        </w:rPr>
+        <w:t>Project Koku</w:t>
+      </w:r>
+      <w:r>
+        <w:rPr>
+          <w:color w:val="666666"/>
+          <w:sz w:val="18"/>
+          <w:szCs w:val="18"/>
+        </w:rPr>
+        <w:t xml:space="preserve"> — Open source upstream for Red Hat Lightspeed Cost Management: https://project-koku.github.io/</w:t>
+      </w:r>
+    </w:p>
+    <w:p>
+      <w:r>
+        <w:rPr>
+          <w:b w:val="1"/>
+          <w:bCs w:val="1"/>
+          <w:color w:val="666666"/>
+          <w:sz w:val="18"/>
+          <w:szCs w:val="18"/>
+        </w:rPr>
+        <w:t>koku-metrics-operator</w:t>
+      </w:r>
+      <w:r>
+        <w:rPr>
+          <w:color w:val="666666"/>
+          <w:sz w:val="18"/>
+          <w:szCs w:val="18"/>
+        </w:rPr>
+        <w:t xml:space="preserve"> — OpenShift operator for metering data collection: https://github.com/project-koku/koku-metrics-operator</w:t>
+      </w:r>
+    </w:p>
+    <w:p>
+      <w:r>
+        <w:rPr>
+          <w:b w:val="1"/>
+          <w:bCs w:val="1"/>
+          <w:color w:val="666666"/>
+          <w:sz w:val="18"/>
+          <w:szCs w:val="18"/>
+        </w:rPr>
+        <w:t>DCM Project</w:t>
+      </w:r>
+      <w:r>
+        <w:rPr>
+          <w:color w:val="666666"/>
+          <w:sz w:val="18"/>
+          <w:szCs w:val="18"/>
+        </w:rPr>
+        <w:t xml:space="preserve"> — Data Center Management control plane: https://dcm-project.github.io/</w:t>
       </w:r>
     </w:p>
     <w:sectPr>

</xml_diff>

<commit_message>
Refine Resources section: remove koku-metrics-operator, add clickable hyperlinks, adjust spacing
Made-with: Cursor
</commit_message>
<xml_diff>
--- a/docs/Metering-and-Cost-Management-for-Sovereign-Clouds.docx
+++ b/docs/Metering-and-Cost-Management-for-Sovereign-Clouds.docx
@@ -1948,6 +1948,9 @@
       </w:r>
     </w:p>
     <w:p>
+      <w:pPr>
+        <w:spacing w:after="120"/>
+      </w:pPr>
       <w:r>
         <w:rPr>
           <w:b w:val="1"/>
@@ -1964,10 +1967,24 @@
           <w:sz w:val="18"/>
           <w:szCs w:val="18"/>
         </w:rPr>
-        <w:t xml:space="preserve"> — Product page and documentation: https://access.redhat.com/products/cost-management</w:t>
-      </w:r>
-    </w:p>
-    <w:p>
+        <w:t xml:space="preserve"> — Product page and documentation: </w:t>
+      </w:r>
+      <w:hyperlink r:id="rId101">
+        <w:r>
+          <w:rPr>
+            <w:color w:val="0563C1"/>
+            <w:u w:val="single"/>
+            <w:sz w:val="18"/>
+            <w:szCs w:val="18"/>
+          </w:rPr>
+          <w:t>https://access.redhat.com/products/cost-management</w:t>
+        </w:r>
+      </w:hyperlink>
+    </w:p>
+    <w:p>
+      <w:pPr>
+        <w:spacing w:after="120"/>
+      </w:pPr>
       <w:r>
         <w:rPr>
           <w:b w:val="1"/>
@@ -1984,10 +2001,24 @@
           <w:sz w:val="18"/>
           <w:szCs w:val="18"/>
         </w:rPr>
-        <w:t xml:space="preserve"> — Open source upstream for Red Hat Lightspeed Cost Management: https://project-koku.github.io/</w:t>
-      </w:r>
-    </w:p>
-    <w:p>
+        <w:t xml:space="preserve"> — Open source upstream for Red Hat Lightspeed Cost Management: </w:t>
+      </w:r>
+      <w:hyperlink r:id="rId102">
+        <w:r>
+          <w:rPr>
+            <w:color w:val="0563C1"/>
+            <w:u w:val="single"/>
+            <w:sz w:val="18"/>
+            <w:szCs w:val="18"/>
+          </w:rPr>
+          <w:t>https://project-koku.github.io/</w:t>
+        </w:r>
+      </w:hyperlink>
+    </w:p>
+    <w:p>
+      <w:pPr>
+        <w:spacing w:after="120"/>
+      </w:pPr>
       <w:r>
         <w:rPr>
           <w:b w:val="1"/>
@@ -1996,7 +2027,7 @@
           <w:sz w:val="18"/>
           <w:szCs w:val="18"/>
         </w:rPr>
-        <w:t>koku-metrics-operator</w:t>
+        <w:t>DCM Project</w:t>
       </w:r>
       <w:r>
         <w:rPr>
@@ -2004,28 +2035,19 @@
           <w:sz w:val="18"/>
           <w:szCs w:val="18"/>
         </w:rPr>
-        <w:t xml:space="preserve"> — OpenShift operator for metering data collection: https://github.com/project-koku/koku-metrics-operator</w:t>
-      </w:r>
-    </w:p>
-    <w:p>
-      <w:r>
-        <w:rPr>
-          <w:b w:val="1"/>
-          <w:bCs w:val="1"/>
-          <w:color w:val="666666"/>
-          <w:sz w:val="18"/>
-          <w:szCs w:val="18"/>
-        </w:rPr>
-        <w:t>DCM Project</w:t>
-      </w:r>
-      <w:r>
-        <w:rPr>
-          <w:color w:val="666666"/>
-          <w:sz w:val="18"/>
-          <w:szCs w:val="18"/>
-        </w:rPr>
-        <w:t xml:space="preserve"> — Data Center Management control plane: https://dcm-project.github.io/</w:t>
-      </w:r>
+        <w:t xml:space="preserve"> — Data Center Management control plane: </w:t>
+      </w:r>
+      <w:hyperlink r:id="rId103">
+        <w:r>
+          <w:rPr>
+            <w:color w:val="0563C1"/>
+            <w:u w:val="single"/>
+            <w:sz w:val="18"/>
+            <w:szCs w:val="18"/>
+          </w:rPr>
+          <w:t>https://dcm-project.github.io/</w:t>
+        </w:r>
+      </w:hyperlink>
     </w:p>
     <w:sectPr>
       <w:headerReference r:id="rId11" w:type="default"/>

</xml_diff>

<commit_message>
Add DRAFT watermark to white paper
- Inject diagonal red semi-transparent "DRAFT" VML watermark into the
  DOCX default header so it appears on every page in both DOCX and PDF
- Add "— DRAFT" suffix to the Markdown title and a blockquote banner
- Regenerate DOCX and PDF

Made-with: Cursor
</commit_message>
<xml_diff>
--- a/docs/Metering-and-Cost-Management-for-Sovereign-Clouds.docx
+++ b/docs/Metering-and-Cost-Management-for-Sovereign-Clouds.docx
@@ -2262,6 +2262,41 @@
           </a:graphic>
         </wp:anchor>
       </w:drawing>
+    </w:r>
+  </w:p>
+  <w:p>
+    <w:r>
+      <w:pict>
+        <v:shapetype id="_x0000_t136" coordsize="21600,21600" o:spt="136" adj="10800" path="m@7,l@8,m@5,21600l@6,21600e">
+          <v:formulas>
+            <v:f eqn="sum #0 0 10800"/>
+            <v:f eqn="prod #0 2 1"/>
+            <v:f eqn="sum 21600 0 @1"/>
+            <v:f eqn="sum 0 0 @2"/>
+            <v:f eqn="sum 21600 0 @3"/>
+            <v:f eqn="if @0 @3 0"/>
+            <v:f eqn="if @0 21600 @1"/>
+            <v:f eqn="if @0 0 @2"/>
+            <v:f eqn="if @0 @4 21600"/>
+            <v:f eqn="mid @5 @6"/>
+            <v:f eqn="mid @8 @5"/>
+            <v:f eqn="mid @7 @8"/>
+            <v:f eqn="mid @6 @7"/>
+            <v:f eqn="sum @6 0 @5"/>
+          </v:formulas>
+          <v:path textpathok="t" o:connecttype="custom" o:connectlocs="@9,0;@10,10800;@11,21600;@12,10800" o:connectangles="270,180,90,0"/>
+          <v:textpath on="t" fitshape="t"/>
+          <v:handles>
+            <v:h position="#0,bottomRight" xrange="6629,14971"/>
+          </v:handles>
+          <o:lock v:ext="edit" text="t" shapetype="t"/>
+        </v:shapetype>
+        <v:shape id="DraftWatermark" o:spid="_x0000_s2049" type="#_x0000_t136" style="position:absolute;margin-left:0;margin-top:0;width:450pt;height:150pt;rotation:-45;z-index:-251657216;mso-position-horizontal:center;mso-position-horizontal-relative:page;mso-position-vertical:center;mso-position-vertical-relative:page" o:allowincell="f" fillcolor="red" stroked="f">
+          <v:fill opacity=".25"/>
+          <v:textpath style="font-family:&quot;Red Hat Display&quot;;font-size:72pt;font-weight:bold" string="DRAFT"/>
+          <w10:wrap anchorx="page" anchory="page"/>
+        </v:shape>
+      </w:pict>
     </w:r>
   </w:p>
 </w:hdr>

</xml_diff>